<commit_message>
Update FitCore: 1047 members, Oct 2023–Apr 2025 data range
- docs/fitcore-churn.html  → Live dashboard (GitHub Pages)
- projects/FitCore_Customer_Churn/dashboard.html  → Project copy
- SQL schema + 10 analytical queries
- Power Query M transformations (3 tables)
- 40+ DAX measures (churn, MRR, LTV, NPS, cohort retention)
- data/FitCore_Churn_Data.xlsx  → 1,047 members Oct 2023–Apr 2025
- FitCore_Project_Description.docx
- README
</commit_message>
<xml_diff>
--- a/projects/FitCore_Customer_Churn/FitCore_Project_Description.docx
+++ b/projects/FitCore_Customer_Churn/FitCore_Project_Description.docx
@@ -108,7 +108,7 @@
           <w:i w:val="0"/>
           <w:sz w:val="24"/>
         </w:rPr>
-        <w:t>FY2022 – FY2026</w:t>
+        <w:t>Oct 2023 – Apr 2025</w:t>
       </w:r>
     </w:p>
     <w:p>
@@ -326,7 +326,7 @@
           <w:rFonts w:ascii="Calibri" w:hAnsi="Calibri"/>
           <w:sz w:val="22"/>
         </w:rPr>
-        <w:t>Before any analysis, you need data. The foundation of this project is a spreadsheet containing records for 3,000 gym members spanning from January 2022 to December 2026.</w:t>
+        <w:t>Before any analysis, you need data. The foundation of this project is a spreadsheet containing records for 1,047 gym members spanning from October 2023 to April 2025.</w:t>
       </w:r>
     </w:p>
     <w:p/>
@@ -2102,7 +2102,7 @@
                 <w:rFonts w:ascii="Calibri" w:hAnsi="Calibri"/>
                 <w:sz w:val="20"/>
               </w:rPr>
-              <w:t>The FitCore_Churn_Data.xlsx spreadsheet holds 3,000 member records. This is the raw truth.</w:t>
+              <w:t>The FitCore_Churn_Data.xlsx spreadsheet holds 1,047 member records. This is the raw truth.</w:t>
             </w:r>
           </w:p>
         </w:tc>
@@ -2802,7 +2802,7 @@
           <w:rFonts w:ascii="Calibri" w:hAnsi="Calibri"/>
           <w:sz w:val="22"/>
         </w:rPr>
-        <w:t>Created a 3,000-row dataset with realistic distributions — churn skewed toward lower plans, visit frequency correlated with retention, NPS scores correlated with satisfaction.</w:t>
+        <w:t>Created a 1,047-row dataset with realistic distributions — churn skewed toward higher-priced plans, visit frequency correlated with retention, NPS scores correlated with satisfaction.</w:t>
       </w:r>
     </w:p>
     <w:p/>
@@ -2826,7 +2826,7 @@
           <w:color w:val="595959"/>
           <w:sz w:val="20"/>
         </w:rPr>
-        <w:t>FitCore Gym Customer Churn Analysis  |  Madhura Pal  |  FY2022–FY2026</w:t>
+        <w:t>FitCore Gym Customer Churn Analysis  |  Madhura Pal  |  Oct 2023–Apr 2025</w:t>
       </w:r>
     </w:p>
     <w:sectPr>

</xml_diff>